<commit_message>
delete users with no active PCRs
</commit_message>
<xml_diff>
--- a/docs/PCR Application - Administrator Guide.docx
+++ b/docs/PCR Application - Administrator Guide.docx
@@ -4321,135 +4321,22 @@
         <w:ind w:left="317"/>
       </w:pPr>
       <w:proofErr w:type="gramStart"/>
-      <w:r>
-        <w:rPr>
-          <w:b/>
-          <w:caps/>
-          <w:color w:val="8B1E2D"/>
-          <w:sz w:val="19"/>
+      <w:proofErr w:type="gramEnd"/>
+      <w:proofErr w:type="gramStart"/>
+      <w:proofErr w:type="gramEnd"/>
+      <w:proofErr w:type="gramStart"/>
+      <w:proofErr w:type="gramEnd"/>
+      <w:r>
+        <w:rPr>
+          <w:b/>
         </w:rPr>
         <w:t xml:space="preserve">Note  </w:t>
       </w:r>
       <w:r>
         <w:rPr>
           <w:i/>
-          <w:color w:val="595959"/>
-        </w:rPr>
-        <w:t>Deletion</w:t>
-      </w:r>
-      <w:proofErr w:type="gramEnd"/>
-      <w:r>
-        <w:rPr>
-          <w:i/>
-          <w:color w:val="595959"/>
-        </w:rPr>
-        <w:t xml:space="preserve"> only works for accounts that have never had a PCR report submitted under them </w:t>
-      </w:r>
-      <w:r>
-        <w:rPr>
-          <w:i/>
-          <w:color w:val="595959"/>
-        </w:rPr>
-        <w:t>(</w:t>
-      </w:r>
-      <w:r>
-        <w:rPr>
-          <w:i/>
-          <w:color w:val="595959"/>
-        </w:rPr>
-        <w:t>the system blocks it otherwise, to protect that report's history</w:t>
-      </w:r>
-      <w:r>
-        <w:rPr>
-          <w:i/>
-          <w:color w:val="595959"/>
-        </w:rPr>
-        <w:t>)</w:t>
-      </w:r>
-      <w:r>
-        <w:rPr>
-          <w:i/>
-          <w:color w:val="595959"/>
-        </w:rPr>
-        <w:t xml:space="preserve">. For anyone who's </w:t>
-      </w:r>
-      <w:proofErr w:type="gramStart"/>
-      <w:r>
-        <w:rPr>
-          <w:i/>
-          <w:color w:val="595959"/>
-        </w:rPr>
-        <w:t>actually been</w:t>
-      </w:r>
-      <w:proofErr w:type="gramEnd"/>
-      <w:r>
-        <w:rPr>
-          <w:i/>
-          <w:color w:val="595959"/>
-        </w:rPr>
-        <w:t xml:space="preserve"> an active responder, use </w:t>
-      </w:r>
-      <w:r>
-        <w:rPr>
-          <w:b/>
-          <w:bCs/>
-          <w:i/>
-          <w:color w:val="595959"/>
-        </w:rPr>
-        <w:t>Deactivate</w:t>
-      </w:r>
-      <w:r>
-        <w:rPr>
-          <w:i/>
-          <w:color w:val="595959"/>
-        </w:rPr>
-        <w:t xml:space="preserve"> instead (see below); </w:t>
-      </w:r>
-      <w:r>
-        <w:rPr>
-          <w:b/>
-          <w:bCs/>
-          <w:i/>
-          <w:color w:val="595959"/>
-        </w:rPr>
-        <w:t>Delete</w:t>
-      </w:r>
-      <w:r>
-        <w:rPr>
-          <w:i/>
-          <w:color w:val="595959"/>
-        </w:rPr>
-        <w:t xml:space="preserve"> is </w:t>
-      </w:r>
-      <w:proofErr w:type="gramStart"/>
-      <w:r>
-        <w:rPr>
-          <w:i/>
-          <w:color w:val="595959"/>
-        </w:rPr>
-        <w:t>really only</w:t>
-      </w:r>
-      <w:proofErr w:type="gramEnd"/>
-      <w:r>
-        <w:rPr>
-          <w:i/>
-          <w:color w:val="595959"/>
-        </w:rPr>
-        <w:t xml:space="preserve"> useful for accounts created by mistake. Username and role also aren't editable from this window</w:t>
-      </w:r>
-      <w:r>
-        <w:rPr>
-          <w:i/>
-          <w:color w:val="595959"/>
-        </w:rPr>
-        <w:t>. I</w:t>
-      </w:r>
-      <w:r>
-        <w:rPr>
-          <w:i/>
-          <w:color w:val="595959"/>
-        </w:rPr>
-        <w:t>f someone needs a role change, delete and recreate the account (only possible if it has no reports yet) or contact whoever maintains the system directly.</w:t>
+        </w:rPr>
+        <w:t>Deletion works as long as the account has no PCR still in progress (draft, submitted, approved, or changes requested) — the system blocks it otherwise, to protect that report's history. Completed and cancelled reports don't count against this; their stats are archived automatically before the account is removed. For anyone who's actually been an active responder, use Deactivate instead (see below); reserve Delete for accounts created by mistake, or for someone genuinely done with the team once their last reports have been completed or cancelled. Username and role also aren't editable from this window. If someone needs a role change, delete and recreate the account (only possible once nothing is still in progress) or contact whoever maintains the system directly.</w:t>
       </w:r>
     </w:p>
     <w:p>
@@ -4691,39 +4578,7 @@
         <w:keepNext/>
       </w:pPr>
       <w:r>
-        <w:t xml:space="preserve">Click </w:t>
-      </w:r>
-      <w:r>
-        <w:rPr>
-          <w:b/>
-          <w:bCs/>
-        </w:rPr>
-        <w:t>Deactivate</w:t>
-      </w:r>
-      <w:r>
-        <w:t xml:space="preserve"> on a user's row to disable their account without deleting it</w:t>
-      </w:r>
-      <w:r>
-        <w:t xml:space="preserve">; </w:t>
-      </w:r>
-      <w:r>
-        <w:t xml:space="preserve">their reports and history stay intact, but they can no longer sign in. Click </w:t>
-      </w:r>
-      <w:r>
-        <w:rPr>
-          <w:b/>
-          <w:bCs/>
-        </w:rPr>
-        <w:t>Activate</w:t>
-      </w:r>
-      <w:r>
-        <w:t xml:space="preserve"> on a deactivated account to restore access. This works for administrator accounts too, not just regular users</w:t>
-      </w:r>
-      <w:r>
-        <w:t xml:space="preserve">, </w:t>
-      </w:r>
-      <w:r>
-        <w:t>useful for a departing admin whose account can't be deleted because they've already submitted PCRs (Section 12, Editing a User).</w:t>
+        <w:t>Click Deactivate on a user's row to disable their account without deleting it; their reports and history stay intact, but they can no longer sign in. Click Activate on a deactivated account to restore access. This works for administrator accounts too, not just regular users, useful for a departing admin whose account still has a PCR in progress and isn't eligible for deletion yet (Section 12, Editing a User).</w:t>
       </w:r>
     </w:p>
     <w:p>
@@ -5584,53 +5439,10 @@
         <w:rPr>
           <w:b/>
         </w:rPr>
-        <w:lastRenderedPageBreak/>
         <w:t xml:space="preserve">Accounts you're sure were created by mistake: </w:t>
       </w:r>
       <w:r>
-        <w:t xml:space="preserve">click </w:t>
-      </w:r>
-      <w:r>
-        <w:rPr>
-          <w:b/>
-          <w:bCs/>
-        </w:rPr>
-        <w:t xml:space="preserve">Delete User </w:t>
-      </w:r>
-      <w:r>
-        <w:t xml:space="preserve">instead, from inside </w:t>
-      </w:r>
-      <w:r>
-        <w:rPr>
-          <w:b/>
-          <w:bCs/>
-        </w:rPr>
-        <w:t>Edit User</w:t>
-      </w:r>
-      <w:r>
-        <w:t>. This only works for accounts with no PCR reports attached</w:t>
-      </w:r>
-      <w:r>
-        <w:t xml:space="preserve">; </w:t>
-      </w:r>
-      <w:r>
-        <w:t>the system blocks deletion of anyone who's ever submitted a report, to protect that report's history</w:t>
-      </w:r>
-      <w:r>
-        <w:t>,</w:t>
-      </w:r>
-      <w:r>
-        <w:t xml:space="preserve"> so in practice </w:t>
-      </w:r>
-      <w:r>
-        <w:rPr>
-          <w:b/>
-          <w:bCs/>
-        </w:rPr>
-        <w:t>Delete</w:t>
-      </w:r>
-      <w:r>
-        <w:t xml:space="preserve"> is rarely the right choice for an actual former responder.</w:t>
+        <w:t>click Delete User instead, from inside Edit User. This only works once the account has nothing still in progress (draft, submitted, approved, or changes requested); completed and cancelled reports don't block it, since their stats are archived automatically. In practice Delete is still rarely the right choice for an actual former responder with a real history; Deactivate is the safer default for them.</w:t>
       </w:r>
     </w:p>
     <w:p>
@@ -5786,28 +5598,17 @@
         <w:spacing w:after="80"/>
         <w:ind w:left="576" w:hanging="576"/>
       </w:pPr>
+      <w:proofErr w:type="gramStart"/>
+      <w:proofErr w:type="gramEnd"/>
       <w:r>
         <w:rPr>
           <w:b/>
         </w:rPr>
         <w:t>2.</w:t>
-      </w:r>
-      <w:r>
-        <w:rPr>
-          <w:b/>
-        </w:rPr>
         <w:tab/>
       </w:r>
       <w:r>
-        <w:t xml:space="preserve">Review the user list (Section 12) the same way: activate anyone returning after a break, deactivate anyone who's stepped back, and delete any </w:t>
-      </w:r>
-      <w:proofErr w:type="gramStart"/>
-      <w:r>
-        <w:t>mistakenly-created</w:t>
-      </w:r>
-      <w:proofErr w:type="gramEnd"/>
-      <w:r>
-        <w:t xml:space="preserve"> accounts that still have no reports attached.</w:t>
+        <w:t>Review the user list (Section 12) the same way: activate anyone returning after a break, deactivate anyone who's stepped back, and delete any mistakenly-created accounts that don't have anything still in progress.</w:t>
       </w:r>
     </w:p>
     <w:p>
@@ -6475,6 +6276,8 @@
       <w:pPr>
         <w:pStyle w:val="ListBullet"/>
       </w:pPr>
+      <w:proofErr w:type="gramStart"/>
+      <w:proofErr w:type="gramEnd"/>
       <w:r>
         <w:rPr>
           <w:b/>
@@ -6482,55 +6285,23 @@
         <w:t xml:space="preserve">Why won't the system let me delete a former responder's account?: </w:t>
       </w:r>
       <w:r>
-        <w:t>They've submitted at least one PCR, and deletion is blocked for any account with reports attached, to protect that report's history. Deactivate the account instead (Section 14)</w:t>
-      </w:r>
-      <w:r>
-        <w:t xml:space="preserve">; </w:t>
-      </w:r>
-      <w:r>
-        <w:t xml:space="preserve">that's the correct action for anyone who's </w:t>
-      </w:r>
+        <w:t>They likely still have a PCR that hasn't been completed or cancelled yet; deletion is blocked while anything is still in progress. Once every report tied to the account is completed or cancelled (or there simply aren't any), deletion becomes available and their stats stay archived. Deactivate the account instead (Section 14) if you'd rather not wait, or if they've built up a real history you'd rather keep easy to find.</w:t>
+      </w:r>
+    </w:p>
+    <w:p>
+      <w:pPr>
+        <w:pStyle w:val="ListBullet"/>
+      </w:pPr>
       <w:proofErr w:type="gramStart"/>
-      <w:r>
-        <w:t>actually responded</w:t>
-      </w:r>
       <w:proofErr w:type="gramEnd"/>
       <w:r>
-        <w:t xml:space="preserve"> to calls.</w:t>
-      </w:r>
-    </w:p>
-    <w:p>
-      <w:pPr>
-        <w:pStyle w:val="ListBullet"/>
-      </w:pPr>
-      <w:r>
-        <w:rPr>
-          <w:b/>
-        </w:rPr>
-        <w:t xml:space="preserve">A departing admin has already submitted PCRs — what do I </w:t>
-      </w:r>
-      <w:proofErr w:type="gramStart"/>
-      <w:r>
-        <w:rPr>
-          <w:b/>
-        </w:rPr>
-        <w:t>do?:</w:t>
-      </w:r>
-      <w:proofErr w:type="gramEnd"/>
-      <w:r>
-        <w:rPr>
-          <w:b/>
-        </w:rPr>
-        <w:t xml:space="preserve"> </w:t>
-      </w:r>
-      <w:r>
-        <w:t>Deactivate their account (Section 12, Activating and Deactivating a User)</w:t>
-      </w:r>
-      <w:r>
-        <w:t>. D</w:t>
-      </w:r>
-      <w:r>
-        <w:t>eletion will be blocked the same way it would for a regular user with report history. Deactivation works on admin accounts the same as any other, as long as it isn't the account you're currently signed in as and isn't the last active admin left.</w:t>
+        <w:rPr>
+          <w:b/>
+        </w:rPr>
+        <w:t xml:space="preserve">A departing admin has already submitted PCRs — what do I do?: </w:t>
+      </w:r>
+      <w:r>
+        <w:t>If every one of their reports is completed or cancelled, you can delete the account like any other one; their stats stay archived. If something's still in progress, either resolve it first or Deactivate their account instead (Section 12, Activating and Deactivating a User); that works on admin accounts the same as any other, as long as it isn't the one you're currently signed in as and isn't the last active admin left.</w:t>
       </w:r>
     </w:p>
     <w:sectPr>

</xml_diff>